<commit_message>
Pitch v2: apply round-1 author decisions (two samples, no total-effect claim, FT50 targets, drop AI referee scores and coauthor ask)
The previous commit carried this message but only a rebuilt docx; this commit holds the content changes.

Co-Authored-By: Claude Fable 5.1 <noreply@anthropic.com>
Claude-Session: https://claude.ai/code/session_01X9zWWRKgewjGCkFj5ptPbE
</commit_message>
<xml_diff>
--- a/genai-productivity-pitch/pitch_v2.docx
+++ b/genai-productivity-pitch/pitch_v2.docx
@@ -1127,7 +1127,7 @@
         <w:t xml:space="preserve"> </w:t>
       </w:r>
       <w:r>
-        <w:t xml:space="preserve">of AI’s effect, under the assumption that scholars with different pre-period method mixes would have followed parallel paths within their field, checked over the clean pre-period 2019Q1–2022Q3, which lies outside the window used to select the sample and measure shares, with sensitivity bands for violations (Rambachan &amp; Roth 2023). A level effect needs an anchor (primary-data methods unaffected through 2024) and is reported only as a secondary exhibit with bands for anchor effects of ±10 and ±25% (Appendix A2).</w:t>
+        <w:t xml:space="preserve">of AI’s effect, under the assumption that scholars with different pre-period method mixes would have followed parallel paths within their field, checked over the clean pre-period 2019Q1–2022Q3, which lies outside the window used to select the sample and measure shares, with sensitivity bands for violations (Rambachan &amp; Roth 2023). The paper does not claim a total effect of AI; the gradient is the object of interest (Appendix A2).</w:t>
       </w:r>
     </w:p>
     <w:p>
@@ -1653,7 +1653,7 @@
         <w:t xml:space="preserve"> </w:t>
       </w:r>
       <w:r>
-        <w:t xml:space="preserve">Academic authors with at least three finance or accounting SSRN papers in 2014–2018 (also the share window), observed 2014Q1–2026Q2; 2026Q3 is reported but incomplete. Robustness: the 2018–2021 definition (more junior scholars, shorter clean pre-period) and thresholds of two and five papers. Practitioner authors form a comparison group; journal-pipeline postings (preprints posted at submission by participating journals) are excluded in a robustness specification; attrition is handled with an activity indicator (Appendix A4).</w:t>
+        <w:t xml:space="preserve">Two samples. Main: academic authors with at least three finance or accounting SSRN papers in 2014–2018 (also the share window), observed 2014Q1–2026Q2, with 2026Q3 reported but incomplete; this sample carries the identification claim because its pre-period is clean. Second: the original definition, at least two papers in 2018–2021 with shares measured on those papers, which adds scholars who entered after 2018 and serves the career-stage tests of H4, at the cost of a clean pre-period of only 2022Q1–Q3. Thresholds of two and five papers as robustness. Practitioner authors form a comparison group; journal-pipeline postings (preprints posted at submission by participating journals) are excluded in a robustness specification; attrition is handled with an activity indicator (Appendix A4).</w:t>
       </w:r>
     </w:p>
     <w:p>
@@ -1897,7 +1897,7 @@
         <w:t xml:space="preserve"> </w:t>
       </w:r>
       <w:r>
-        <w:t xml:space="preserve">Journal slots are roughly fixed in the short run, so a larger supply lowers the share published within any window even if quality is unchanged: a lower 24-month share is the null, not evidence of weaker papers (Appendix A3). We therefore use outcomes that do not depend on journal queues (conference acceptance within 12 months; citations at 24 months against same-cohort, same-method papers; near-duplicates) and model publication as a discrete-time hazard with right-censoring and journal turnaround as a covariate. The more-versus-better prediction: the methods whose output rose most show lower marginal quality on the slot-free outcomes. AI referee scores (Lu, Luo &amp; Yu 2026) enter only if a test on pre-2022 papers shows no preference for AI-style text; the 36- and 48-month outcomes (2027, 2028) form a pre-registered companion paper.</w:t>
+        <w:t xml:space="preserve">Journal slots are roughly fixed in the short run, so a larger supply lowers the share published within any window even if quality is unchanged: a lower 24-month share is the null, not evidence of weaker papers (Appendix A3). We therefore use outcomes that do not depend on journal queues (conference acceptance within 12 months; citations at 24 months against same-cohort, same-method papers; near-duplicates) and model publication as a discrete-time hazard with right-censoring and journal turnaround as a covariate. The more-versus-better prediction: the methods whose output rose most show lower marginal quality on the slot-free outcomes. The 36- and 48-month outcomes (2027, 2028) form a pre-registered companion paper.</w:t>
       </w:r>
     </w:p>
     <w:bookmarkEnd w:id="27"/>
@@ -2422,13 +2422,13 @@
           <w:bCs/>
           <w:b/>
         </w:rPr>
-        <w:t xml:space="preserve">Target outputs.</w:t>
-      </w:r>
-      <w:r>
-        <w:t xml:space="preserve"> </w:t>
-      </w:r>
-      <w:r>
-        <w:t xml:space="preserve">Lead:</w:t>
+        <w:t xml:space="preserve">Target outputs</w:t>
+      </w:r>
+      <w:r>
+        <w:t xml:space="preserve"> </w:t>
+      </w:r>
+      <w:r>
+        <w:t xml:space="preserve">(FT50 only). Lead:</w:t>
       </w:r>
       <w:r>
         <w:t xml:space="preserve"> </w:t>
@@ -2441,7 +2441,7 @@
         <w:t xml:space="preserve">Management Science</w:t>
       </w:r>
       <w:r>
-        <w:t xml:space="preserve">, cross-field, led by the event-study figure and the regime heterogeneity. Finance-led alternative:</w:t>
+        <w:t xml:space="preserve">, the one cross-field FT50 outlet for this design, led by the event-study figure and the regime heterogeneity. Finance-led alternative:</w:t>
       </w:r>
       <w:r>
         <w:t xml:space="preserve"> </w:t>
@@ -2464,25 +2464,38 @@
           <w:iCs/>
           <w:i/>
         </w:rPr>
+        <w:t xml:space="preserve">RFS</w:t>
+      </w:r>
+      <w:r>
+        <w:t xml:space="preserve">,</w:t>
+      </w:r>
+      <w:r>
+        <w:t xml:space="preserve"> </w:t>
+      </w:r>
+      <w:r>
+        <w:rPr>
+          <w:iCs/>
+          <w:i/>
+        </w:rPr>
+        <w:t xml:space="preserve">JFQA</w:t>
+      </w:r>
+      <w:r>
+        <w:t xml:space="preserve"> </w:t>
+      </w:r>
+      <w:r>
+        <w:t xml:space="preserve">or the</w:t>
+      </w:r>
+      <w:r>
+        <w:t xml:space="preserve"> </w:t>
+      </w:r>
+      <w:r>
+        <w:rPr>
+          <w:iCs/>
+          <w:i/>
+        </w:rPr>
         <w:t xml:space="preserve">Review of Finance</w:t>
       </w:r>
       <w:r>
-        <w:t xml:space="preserve"> </w:t>
-      </w:r>
-      <w:r>
-        <w:t xml:space="preserve">or</w:t>
-      </w:r>
-      <w:r>
-        <w:t xml:space="preserve"> </w:t>
-      </w:r>
-      <w:r>
-        <w:rPr>
-          <w:iCs/>
-          <w:i/>
-        </w:rPr>
-        <w:t xml:space="preserve">JFQA</w:t>
-      </w:r>
-      <w:r>
         <w:t xml:space="preserve">; the</w:t>
       </w:r>
       <w:r>
@@ -2499,7 +2512,7 @@
         <w:t xml:space="preserve"> </w:t>
       </w:r>
       <w:r>
-        <w:t xml:space="preserve">only with a credible level design. Accounting companion (posting stage, top-six publication, conference outcomes):</w:t>
+        <w:t xml:space="preserve">is unlikely for a paper that reports a method gradient rather than a total effect. Accounting companion (posting stage, top-six publication, conference outcomes):</w:t>
       </w:r>
       <w:r>
         <w:t xml:space="preserve"> </w:t>
@@ -2510,22 +2523,6 @@
           <w:i/>
         </w:rPr>
         <w:t xml:space="preserve">Contemporary Accounting Research</w:t>
-      </w:r>
-      <w:r>
-        <w:t xml:space="preserve"> </w:t>
-      </w:r>
-      <w:r>
-        <w:t xml:space="preserve">or</w:t>
-      </w:r>
-      <w:r>
-        <w:t xml:space="preserve"> </w:t>
-      </w:r>
-      <w:r>
-        <w:rPr>
-          <w:iCs/>
-          <w:i/>
-        </w:rPr>
-        <w:t xml:space="preserve">Accounting Horizons</w:t>
       </w:r>
       <w:r>
         <w:t xml:space="preserve">. The 2028 publication-outcome paper:</w:t>
@@ -2601,7 +2598,7 @@
         <w:t xml:space="preserve"> </w:t>
       </w:r>
       <w:r>
-        <w:t xml:space="preserve">The design identifies differences between methods, not the total effect of AI; the anchored level rests on an assumption. Working papers proxy for research output, and in accounting SSRN is a stage-dependent window on it. The vocabulary measure captures AI-assisted writing only. Finance barely varies in experimental, survey and review methods, so H1 and H3 are largely identified from accounting scholars, and theory cells are small; the power statement says what can be detected.</w:t>
+        <w:t xml:space="preserve">The design identifies differences between methods, not the total effect of AI. Working papers proxy for research output, and in accounting SSRN is a stage-dependent window on it. The vocabulary measure captures AI-assisted writing only. Finance barely varies in experimental, survey and review methods, so H1 and H3 are largely identified from accounting scholars, and theory cells are small; the power statement says what can be detected.</w:t>
       </w:r>
     </w:p>
     <w:p>
@@ -2624,28 +2621,6 @@
       </w:r>
       <w:r>
         <w:t xml:space="preserve">Metadata come from Crossref and OpenAlex (CC0), never from scraping SSRN; abstracts feed computed measures only. A low-risk application to the Adelaide HREC goes in during the first week of November. Stage 1 (November 2026 to February 2027) delivers draft v1 and an AFA 2028 submission; stage 2 (to June 2027) adds the quality outcomes and heterogeneity; stage 3 the 2027–28 updates. Cash cost about A$8–10k for stage 1 and A$18–25k in all (Appendix A6).</w:t>
-      </w:r>
-    </w:p>
-    <w:p>
-      <w:pPr>
-        <w:numPr>
-          <w:ilvl w:val="0"/>
-          <w:numId w:val="1006"/>
-        </w:numPr>
-        <w:pStyle w:val="Compact"/>
-      </w:pPr>
-      <w:r>
-        <w:rPr>
-          <w:bCs/>
-          <w:b/>
-        </w:rPr>
-        <w:t xml:space="preserve">What I am looking for.</w:t>
-      </w:r>
-      <w:r>
-        <w:t xml:space="preserve"> </w:t>
-      </w:r>
-      <w:r>
-        <w:t xml:space="preserve">Two coauthors: an accounting researcher who knows the BYU taxonomy, the AAA and FARS circuit and the accounting journals, to own the accounting classification, the posting-stage analysis and the accounting positioning; and an applied econometrician or data engineer at home with event-study Poisson designs and the OpenAlex and Crossref APIs, to own identification, inference and the replication package. What exists now: the OpenAlex and Crossref tabulations behind (D), the draft design and this pitch. [Division of labour, authorship order and time commitments: to discuss at the first meeting.]</w:t>
       </w:r>
     </w:p>
     <w:bookmarkEnd w:id="31"/>
@@ -2875,7 +2850,7 @@
         <w:t xml:space="preserve"> </w:t>
       </w:r>
       <w:r>
-        <w:t xml:space="preserve">over methods gives a scholar’s effect relative to such a scholar, not the AI share of total growth. The anchored level adds the assumption that the reference methods are unaffected, and we report how the level moves if that assumption is off by ±10 or ±25%. Linearity of the shares inside the exponent restricts mixed-method scholars; the paper-level model relaxes it. Career-stage bins are coarse (five years) because career age is collinear with scholar and period effects.</w:t>
+        <w:t xml:space="preserve">over methods gives a scholar’s effect relative to such a scholar, not the AI share of total growth. A level could only be recovered by assuming the reference methods are unaffected; we do not make that claim. Linearity of the shares inside the exponent restricts mixed-method scholars; the paper-level model relaxes it. Career-stage bins are coarse (five years) because career age is collinear with scholar and period effects.</w:t>
       </w:r>
     </w:p>
     <w:p>
@@ -2893,7 +2868,7 @@
         <w:t xml:space="preserve"> </w:t>
       </w:r>
       <w:r>
-        <w:t xml:space="preserve">The sample is selected, and shares are measured, on 2014–2018; the pre-trend test runs over 2019Q1–2022Q3, so it is not computed inside the window that conditions the sample, and the COVID quarters are displayed rather than hidden (SSRN output rose sharply in the first weeks of the 2020 lockdowns, Cui, Ding &amp; Zhu 2022, and the pandemic shifted finance productivity unevenly, Barber et al. 2021). Mean reversion after selection would show up in 2019–2022 if it mattered. For quality: if a cohort posts</w:t>
+        <w:t xml:space="preserve">The main sample is selected, and shares are measured, on 2014–2018; the pre-trend test runs over 2019Q1–2022Q3, so it is not computed inside the window that conditions the sample (in the second sample the two windows overlap, which is why it does not carry the identification claim), and the COVID quarters are displayed rather than hidden (SSRN output rose sharply in the first weeks of the 2020 lockdowns, Cui, Ding &amp; Zhu 2022, and the pandemic shifted finance productivity unevenly, Barber et al. 2021). Mean reversion after selection would show up in 2019–2022 if it mattered. For quality: if a cohort posts</w:t>
       </w:r>
       <w:r>
         <w:t xml:space="preserve"> </w:t>
@@ -3970,30 +3945,6 @@
       </w:r>
       <w:r>
         <w:t xml:space="preserve">(Working paper). arXiv 2607.28968.</w:t>
-      </w:r>
-    </w:p>
-    <w:p>
-      <w:pPr>
-        <w:pStyle w:val="Bibliography"/>
-      </w:pPr>
-      <w:r>
-        <w:t xml:space="preserve">Lu, H., Luo, Y., &amp; Yu, L. (2026).</w:t>
-      </w:r>
-      <w:r>
-        <w:t xml:space="preserve"> </w:t>
-      </w:r>
-      <w:r>
-        <w:rPr>
-          <w:iCs/>
-          <w:i/>
-        </w:rPr>
-        <w:t xml:space="preserve">How well do LLMs perform in peer review? Evidence from finance and accounting</w:t>
-      </w:r>
-      <w:r>
-        <w:t xml:space="preserve"> </w:t>
-      </w:r>
-      <w:r>
-        <w:t xml:space="preserve">(Working paper). SSRN 7607363.</w:t>
       </w:r>
     </w:p>
     <w:p>

</xml_diff>